<commit_message>
Edit manuscript: reduce textual overlap with companion paper; add empirical feature-classification tables, modelling recommendations, pH-hub analysis and leakage-aware Discussion (all changes highlighted in the docx)
Co-Authored-By: Claude Opus 4.8 <noreply@anthropic.com>
</commit_message>
<xml_diff>
--- a/article/manuscript_edited.docx
+++ b/article/manuscript_edited.docx
@@ -601,9 +601,9 @@
       </w:pPr>
       <w:r>
         <w:rPr>
-          <w:highlight w:val="yellow"/>
-        </w:rPr>
-        <w:t>In contrast to our previous study [18], which was focused on focusing on spatial validation hierarchy and benchmarking ML and DL architectures, the current manuscript provides the first comprehensive, knowledge-driven exploration of the underlying soil-spectroscopy relationships in the Central Asian steppe. The goal of the present work was to establish the fundamental limits of remote sensing for specific agrochemical properties.</w:t>
+          <w:highlight w:val="green"/>
+        </w:rPr>
+        <w:t>In contrast to our previous study [18], which focused on the spatial-validation hierarchy and on benchmarking ML and DL architectures, the present manuscript provides the first comprehensive, knowledge-driven exploration of the underlying soil–spectroscopy relationships in the Central Asian steppe; its aim is to establish the fundamental limits of remote sensing for individual agrochemical properties.</w:t>
       </w:r>
     </w:p>
     <w:p>
@@ -15227,6 +15227,17 @@
     </w:p>
     <w:p>
       <w:pPr>
+        <w:pStyle w:val="MDPI31text"/>
+      </w:pPr>
+      <w:r>
+        <w:rPr>
+          <w:highlight w:val="green"/>
+        </w:rPr>
+        <w:t>To separate genuine inter-property links from shared-driver artefacts, partial Spearman correlations controlling for pH were computed (pH being the most strongly inter-correlated property). The SOC–P2O5 association collapses from +0.14 to +0.03 once pH is partialled out (≈82% pH-mediated), and P2O5–S and SOC–S weaken by ~40%, indicating that much of the inter-nutrient covariance is induced by the common carbonate/pH gradient (in calcareous high-pH soils both P and S are retained/fixed). Conversely, the fertiliser co-application links (NO3–P2O5, P2O5–K2O, K2O–S, NO3–S) and the SOC–NO3 (mineralisation) and SOC–K2O (CEC) links strengthen after removing pH — i.e. pH masks them. pH thus acts as a hub that both creates indirect correlations and suppresses real ones; because pH is also the most remotely-sensable property, any feature tracking the pH/carbonate gradient will indirectly co-vary with P2O5, S and NO3, which is the pedological basis for the confounding examined in Sections 3.3.1 and 3.8.</w:t>
+      </w:r>
+    </w:p>
+    <w:p>
+      <w:pPr>
         <w:pStyle w:val="MDPI22heading2"/>
         <w:spacing w:before="240" w:after="60"/>
         <w:rPr/>
@@ -15276,7 +15287,7 @@
         <w:rPr>
           <w:highlight w:val="green"/>
         </w:rPr>
-        <w:t>The hierarchy of "predictability" based on |ρ|max across all features was as follows (Table 7, Figure 5): pH (0.670) ≫ P2O5 (0.525, GLCM-texture of the Red band in autumn) &gt; K2O (0.478, BSI_spring) &gt; NO3 (0.431, SAVI_spring) &gt; S (0.383, SAVI_late-summer) &gt; SOC (0.368, slope). Notably, for P2O5, K2O, NO3 and S, the leading predictors are spectral or textural (GLCM, SAVI, BSI), not climatic or topographic. Only pH and SOC have climatic/topographic predictors among the top-5 on a par with spectral ones.</w:t>
+        <w:t>The leakage-controlled predictability hierarchy (Table 7; per-feature detail in Table S1, Figure 5) was: pH (0.670, GNDVI_L8 spring) ≫ K2O (0.478, BSI_S2 spring) ≈ P2O5 (0.476, growing-season temperature) &gt; NO3 (0.431, SAVI_S2 spring) &gt; SOC (0.368, slope) &gt; S (0.309, spring blue band). Under the unrestricted full pool P2O5 and S reach higher values (0.525 via autumn GLCM texture and 0.383 via late-summer SAVI), but these rest on cross-season features misaligned with the spring-dominant sampling and do not survive out-of-farm validation (Section 3.3.3); the leakage-controlled values are therefore used as the headline.</w:t>
       </w:r>
     </w:p>
     <w:p>
@@ -15311,43 +15322,9 @@
       </w:pPr>
       <w:r>
         <w:rPr>
-          <w:b/>
-          <w:sz w:val="18"/>
-          <w:szCs w:val="18"/>
-        </w:rPr>
-        <w:t xml:space="preserve">Table 7. </w:t>
-      </w:r>
-      <w:r>
-        <w:rPr>
-          <w:bCs/>
-          <w:sz w:val="18"/>
-          <w:szCs w:val="18"/>
-        </w:rPr>
-        <w:t xml:space="preserve">Strongest correlations (Spearman </w:t>
-      </w:r>
-      <w:r>
-        <w:rPr>
-          <w:i/>
-          <w:iCs/>
-          <w:lang w:val="ru-RU"/>
-        </w:rPr>
-        <w:t>ρ</w:t>
-      </w:r>
-      <w:r>
-        <w:rPr>
-          <w:bCs/>
-          <w:sz w:val="18"/>
-          <w:szCs w:val="18"/>
-        </w:rPr>
-        <w:t>) for each property (up to 5 best correlations)</w:t>
-      </w:r>
-      <w:r>
-        <w:rPr>
-          <w:iCs/>
-          <w:sz w:val="18"/>
-          <w:szCs w:val="18"/>
-        </w:rPr>
-        <w:t xml:space="preserve">. </w:t>
+          <w:highlight w:val="green"/>
+        </w:rPr>
+        <w:t>Table S1. Strongest single correlations (Spearman ρ, up to 5 per property) — detailed screening output. Superseded for interpretation by the empirical classification in Table 7 (Section 3.3.3).</w:t>
       </w:r>
     </w:p>
     <w:tbl>
@@ -27254,6 +27231,2455 @@
     </w:p>
     <w:p>
       <w:pPr>
+        <w:pStyle w:val="MDPI23heading3"/>
+      </w:pPr>
+      <w:r>
+        <w:rPr>
+          <w:highlight w:val="green"/>
+        </w:rPr>
+        <w:t>3.3.3. Empirical feature classification and recommendations for modelling</w:t>
+      </w:r>
+    </w:p>
+    <w:p>
+      <w:r>
+        <w:rPr>
+          <w:highlight w:val="green"/>
+        </w:rPr>
+        <w:t>Beyond the single strongest correlation, every one of the 512 features was classified empirically by its cross-validation behaviour into one of four classes — generalizable (a transferable local signal), zonal-only (a regional gradient with no within-field skill), unstable (a year-dependent sign reversal), or weak — by removing spatial-block means (within- vs between-block components) and testing cross-year sign stability. Table 7 summarises the resulting predictability per property; Tables 7a-7e give the class definitions, the leading features of each class with their mechanism, and the implied recommendations for predictive modelling.</w:t>
+      </w:r>
+    </w:p>
+    <w:p>
+      <w:r>
+        <w:rPr>
+          <w:b/>
+          <w:highlight w:val="green"/>
+        </w:rPr>
+        <w:t>Table 7. Empirical classification of remote-sensing features and resulting predictability, by soil property.</w:t>
+      </w:r>
+    </w:p>
+    <w:tbl>
+      <w:tblPr>
+        <w:tblStyle w:val="aff1"/>
+        <w:tblW w:type="auto" w:w="0"/>
+        <w:tblLook w:firstColumn="1" w:firstRow="1" w:lastColumn="0" w:lastRow="0" w:noHBand="0" w:noVBand="1" w:val="04A0"/>
+      </w:tblPr>
+      <w:tblGrid>
+        <w:gridCol w:w="1308"/>
+        <w:gridCol w:w="1308"/>
+        <w:gridCol w:w="1308"/>
+        <w:gridCol w:w="1308"/>
+        <w:gridCol w:w="1308"/>
+        <w:gridCol w:w="1308"/>
+        <w:gridCol w:w="1308"/>
+        <w:gridCol w:w="1308"/>
+      </w:tblGrid>
+      <w:tr>
+        <w:tc>
+          <w:tcPr>
+            <w:tcW w:type="dxa" w:w="1308"/>
+          </w:tcPr>
+          <w:p>
+            <w:r>
+              <w:rPr>
+                <w:b/>
+                <w:sz w:val="16"/>
+                <w:highlight w:val="green"/>
+              </w:rPr>
+              <w:t>Property</w:t>
+            </w:r>
+          </w:p>
+        </w:tc>
+        <w:tc>
+          <w:tcPr>
+            <w:tcW w:type="dxa" w:w="1308"/>
+          </w:tcPr>
+          <w:p>
+            <w:r>
+              <w:rPr>
+                <w:b/>
+                <w:sz w:val="16"/>
+                <w:highlight w:val="green"/>
+              </w:rPr>
+              <w:t>|ρ|max (LC)</w:t>
+            </w:r>
+          </w:p>
+        </w:tc>
+        <w:tc>
+          <w:tcPr>
+            <w:tcW w:type="dxa" w:w="1308"/>
+          </w:tcPr>
+          <w:p>
+            <w:r>
+              <w:rPr>
+                <w:b/>
+                <w:sz w:val="16"/>
+                <w:highlight w:val="green"/>
+              </w:rPr>
+              <w:t>Farm-LOFO ρ</w:t>
+            </w:r>
+          </w:p>
+        </w:tc>
+        <w:tc>
+          <w:tcPr>
+            <w:tcW w:type="dxa" w:w="1308"/>
+          </w:tcPr>
+          <w:p>
+            <w:r>
+              <w:rPr>
+                <w:b/>
+                <w:sz w:val="16"/>
+                <w:highlight w:val="green"/>
+              </w:rPr>
+              <w:t>general. (robust)</w:t>
+            </w:r>
+          </w:p>
+        </w:tc>
+        <w:tc>
+          <w:tcPr>
+            <w:tcW w:type="dxa" w:w="1308"/>
+          </w:tcPr>
+          <w:p>
+            <w:r>
+              <w:rPr>
+                <w:b/>
+                <w:sz w:val="16"/>
+                <w:highlight w:val="green"/>
+              </w:rPr>
+              <w:t>zonal-only</w:t>
+            </w:r>
+          </w:p>
+        </w:tc>
+        <w:tc>
+          <w:tcPr>
+            <w:tcW w:type="dxa" w:w="1308"/>
+          </w:tcPr>
+          <w:p>
+            <w:r>
+              <w:rPr>
+                <w:b/>
+                <w:sz w:val="16"/>
+                <w:highlight w:val="green"/>
+              </w:rPr>
+              <w:t>unstable</w:t>
+            </w:r>
+          </w:p>
+        </w:tc>
+        <w:tc>
+          <w:tcPr>
+            <w:tcW w:type="dxa" w:w="1308"/>
+          </w:tcPr>
+          <w:p>
+            <w:r>
+              <w:rPr>
+                <w:b/>
+                <w:sz w:val="16"/>
+                <w:highlight w:val="green"/>
+              </w:rPr>
+              <w:t>weak</w:t>
+            </w:r>
+          </w:p>
+        </w:tc>
+        <w:tc>
+          <w:tcPr>
+            <w:tcW w:type="dxa" w:w="1308"/>
+          </w:tcPr>
+          <w:p>
+            <w:r>
+              <w:rPr>
+                <w:b/>
+                <w:sz w:val="16"/>
+                <w:highlight w:val="green"/>
+              </w:rPr>
+              <w:t>Verdict</w:t>
+            </w:r>
+          </w:p>
+        </w:tc>
+      </w:tr>
+      <w:tr>
+        <w:tc>
+          <w:tcPr>
+            <w:tcW w:type="dxa" w:w="1308"/>
+          </w:tcPr>
+          <w:p>
+            <w:r>
+              <w:rPr>
+                <w:sz w:val="16"/>
+                <w:highlight w:val="green"/>
+              </w:rPr>
+              <w:t>pH</w:t>
+            </w:r>
+          </w:p>
+        </w:tc>
+        <w:tc>
+          <w:tcPr>
+            <w:tcW w:type="dxa" w:w="1308"/>
+          </w:tcPr>
+          <w:p>
+            <w:r>
+              <w:rPr>
+                <w:sz w:val="16"/>
+                <w:highlight w:val="green"/>
+              </w:rPr>
+              <w:t>0.670</w:t>
+            </w:r>
+          </w:p>
+        </w:tc>
+        <w:tc>
+          <w:tcPr>
+            <w:tcW w:type="dxa" w:w="1308"/>
+          </w:tcPr>
+          <w:p>
+            <w:r>
+              <w:rPr>
+                <w:sz w:val="16"/>
+                <w:highlight w:val="green"/>
+              </w:rPr>
+              <w:t>0.43</w:t>
+            </w:r>
+          </w:p>
+        </w:tc>
+        <w:tc>
+          <w:tcPr>
+            <w:tcW w:type="dxa" w:w="1308"/>
+          </w:tcPr>
+          <w:p>
+            <w:r>
+              <w:rPr>
+                <w:sz w:val="16"/>
+                <w:highlight w:val="green"/>
+              </w:rPr>
+              <w:t>13 (6)</w:t>
+            </w:r>
+          </w:p>
+        </w:tc>
+        <w:tc>
+          <w:tcPr>
+            <w:tcW w:type="dxa" w:w="1308"/>
+          </w:tcPr>
+          <w:p>
+            <w:r>
+              <w:rPr>
+                <w:sz w:val="16"/>
+                <w:highlight w:val="green"/>
+              </w:rPr>
+              <w:t>134</w:t>
+            </w:r>
+          </w:p>
+        </w:tc>
+        <w:tc>
+          <w:tcPr>
+            <w:tcW w:type="dxa" w:w="1308"/>
+          </w:tcPr>
+          <w:p>
+            <w:r>
+              <w:rPr>
+                <w:sz w:val="16"/>
+                <w:highlight w:val="green"/>
+              </w:rPr>
+              <w:t>86</w:t>
+            </w:r>
+          </w:p>
+        </w:tc>
+        <w:tc>
+          <w:tcPr>
+            <w:tcW w:type="dxa" w:w="1308"/>
+          </w:tcPr>
+          <w:p>
+            <w:r>
+              <w:rPr>
+                <w:sz w:val="16"/>
+                <w:highlight w:val="green"/>
+              </w:rPr>
+              <w:t>279</w:t>
+            </w:r>
+          </w:p>
+        </w:tc>
+        <w:tc>
+          <w:tcPr>
+            <w:tcW w:type="dxa" w:w="1308"/>
+          </w:tcPr>
+          <w:p>
+            <w:r>
+              <w:rPr>
+                <w:sz w:val="16"/>
+                <w:highlight w:val="green"/>
+              </w:rPr>
+              <w:t>regionally + locally mappable</w:t>
+            </w:r>
+          </w:p>
+        </w:tc>
+      </w:tr>
+      <w:tr>
+        <w:tc>
+          <w:tcPr>
+            <w:tcW w:type="dxa" w:w="1308"/>
+          </w:tcPr>
+          <w:p>
+            <w:r>
+              <w:rPr>
+                <w:sz w:val="16"/>
+                <w:highlight w:val="green"/>
+              </w:rPr>
+              <w:t>K2O</w:t>
+            </w:r>
+          </w:p>
+        </w:tc>
+        <w:tc>
+          <w:tcPr>
+            <w:tcW w:type="dxa" w:w="1308"/>
+          </w:tcPr>
+          <w:p>
+            <w:r>
+              <w:rPr>
+                <w:sz w:val="16"/>
+                <w:highlight w:val="green"/>
+              </w:rPr>
+              <w:t>0.478</w:t>
+            </w:r>
+          </w:p>
+        </w:tc>
+        <w:tc>
+          <w:tcPr>
+            <w:tcW w:type="dxa" w:w="1308"/>
+          </w:tcPr>
+          <w:p>
+            <w:r>
+              <w:rPr>
+                <w:sz w:val="16"/>
+                <w:highlight w:val="green"/>
+              </w:rPr>
+              <w:t>0.33</w:t>
+            </w:r>
+          </w:p>
+        </w:tc>
+        <w:tc>
+          <w:tcPr>
+            <w:tcW w:type="dxa" w:w="1308"/>
+          </w:tcPr>
+          <w:p>
+            <w:r>
+              <w:rPr>
+                <w:sz w:val="16"/>
+                <w:highlight w:val="green"/>
+              </w:rPr>
+              <w:t>27 (10)</w:t>
+            </w:r>
+          </w:p>
+        </w:tc>
+        <w:tc>
+          <w:tcPr>
+            <w:tcW w:type="dxa" w:w="1308"/>
+          </w:tcPr>
+          <w:p>
+            <w:r>
+              <w:rPr>
+                <w:sz w:val="16"/>
+                <w:highlight w:val="green"/>
+              </w:rPr>
+              <w:t>27</w:t>
+            </w:r>
+          </w:p>
+        </w:tc>
+        <w:tc>
+          <w:tcPr>
+            <w:tcW w:type="dxa" w:w="1308"/>
+          </w:tcPr>
+          <w:p>
+            <w:r>
+              <w:rPr>
+                <w:sz w:val="16"/>
+                <w:highlight w:val="green"/>
+              </w:rPr>
+              <w:t>70</w:t>
+            </w:r>
+          </w:p>
+        </w:tc>
+        <w:tc>
+          <w:tcPr>
+            <w:tcW w:type="dxa" w:w="1308"/>
+          </w:tcPr>
+          <w:p>
+            <w:r>
+              <w:rPr>
+                <w:sz w:val="16"/>
+                <w:highlight w:val="green"/>
+              </w:rPr>
+              <w:t>388</w:t>
+            </w:r>
+          </w:p>
+        </w:tc>
+        <w:tc>
+          <w:tcPr>
+            <w:tcW w:type="dxa" w:w="1308"/>
+          </w:tcPr>
+          <w:p>
+            <w:r>
+              <w:rPr>
+                <w:sz w:val="16"/>
+                <w:highlight w:val="green"/>
+              </w:rPr>
+              <w:t>mappable (clay/SWIR)</w:t>
+            </w:r>
+          </w:p>
+        </w:tc>
+      </w:tr>
+      <w:tr>
+        <w:tc>
+          <w:tcPr>
+            <w:tcW w:type="dxa" w:w="1308"/>
+          </w:tcPr>
+          <w:p>
+            <w:r>
+              <w:rPr>
+                <w:sz w:val="16"/>
+                <w:highlight w:val="green"/>
+              </w:rPr>
+              <w:t>P2O5</w:t>
+            </w:r>
+          </w:p>
+        </w:tc>
+        <w:tc>
+          <w:tcPr>
+            <w:tcW w:type="dxa" w:w="1308"/>
+          </w:tcPr>
+          <w:p>
+            <w:r>
+              <w:rPr>
+                <w:sz w:val="16"/>
+                <w:highlight w:val="green"/>
+              </w:rPr>
+              <w:t>0.476</w:t>
+            </w:r>
+          </w:p>
+        </w:tc>
+        <w:tc>
+          <w:tcPr>
+            <w:tcW w:type="dxa" w:w="1308"/>
+          </w:tcPr>
+          <w:p>
+            <w:r>
+              <w:rPr>
+                <w:sz w:val="16"/>
+                <w:highlight w:val="green"/>
+              </w:rPr>
+              <w:t>0.42</w:t>
+            </w:r>
+          </w:p>
+        </w:tc>
+        <w:tc>
+          <w:tcPr>
+            <w:tcW w:type="dxa" w:w="1308"/>
+          </w:tcPr>
+          <w:p>
+            <w:r>
+              <w:rPr>
+                <w:sz w:val="16"/>
+                <w:highlight w:val="green"/>
+              </w:rPr>
+              <w:t>8 (3)</w:t>
+            </w:r>
+          </w:p>
+        </w:tc>
+        <w:tc>
+          <w:tcPr>
+            <w:tcW w:type="dxa" w:w="1308"/>
+          </w:tcPr>
+          <w:p>
+            <w:r>
+              <w:rPr>
+                <w:sz w:val="16"/>
+                <w:highlight w:val="green"/>
+              </w:rPr>
+              <w:t>25</w:t>
+            </w:r>
+          </w:p>
+        </w:tc>
+        <w:tc>
+          <w:tcPr>
+            <w:tcW w:type="dxa" w:w="1308"/>
+          </w:tcPr>
+          <w:p>
+            <w:r>
+              <w:rPr>
+                <w:sz w:val="16"/>
+                <w:highlight w:val="green"/>
+              </w:rPr>
+              <w:t>33</w:t>
+            </w:r>
+          </w:p>
+        </w:tc>
+        <w:tc>
+          <w:tcPr>
+            <w:tcW w:type="dxa" w:w="1308"/>
+          </w:tcPr>
+          <w:p>
+            <w:r>
+              <w:rPr>
+                <w:sz w:val="16"/>
+                <w:highlight w:val="green"/>
+              </w:rPr>
+              <w:t>446</w:t>
+            </w:r>
+          </w:p>
+        </w:tc>
+        <w:tc>
+          <w:tcPr>
+            <w:tcW w:type="dxa" w:w="1308"/>
+          </w:tcPr>
+          <w:p>
+            <w:r>
+              <w:rPr>
+                <w:sz w:val="16"/>
+                <w:highlight w:val="green"/>
+              </w:rPr>
+              <w:t>weakly mappable (texture)</w:t>
+            </w:r>
+          </w:p>
+        </w:tc>
+      </w:tr>
+      <w:tr>
+        <w:tc>
+          <w:tcPr>
+            <w:tcW w:type="dxa" w:w="1308"/>
+          </w:tcPr>
+          <w:p>
+            <w:r>
+              <w:rPr>
+                <w:sz w:val="16"/>
+                <w:highlight w:val="green"/>
+              </w:rPr>
+              <w:t>NO3</w:t>
+            </w:r>
+          </w:p>
+        </w:tc>
+        <w:tc>
+          <w:tcPr>
+            <w:tcW w:type="dxa" w:w="1308"/>
+          </w:tcPr>
+          <w:p>
+            <w:r>
+              <w:rPr>
+                <w:sz w:val="16"/>
+                <w:highlight w:val="green"/>
+              </w:rPr>
+              <w:t>0.431</w:t>
+            </w:r>
+          </w:p>
+        </w:tc>
+        <w:tc>
+          <w:tcPr>
+            <w:tcW w:type="dxa" w:w="1308"/>
+          </w:tcPr>
+          <w:p>
+            <w:r>
+              <w:rPr>
+                <w:sz w:val="16"/>
+                <w:highlight w:val="green"/>
+              </w:rPr>
+              <w:t>0.22</w:t>
+            </w:r>
+          </w:p>
+        </w:tc>
+        <w:tc>
+          <w:tcPr>
+            <w:tcW w:type="dxa" w:w="1308"/>
+          </w:tcPr>
+          <w:p>
+            <w:r>
+              <w:rPr>
+                <w:sz w:val="16"/>
+                <w:highlight w:val="green"/>
+              </w:rPr>
+              <w:t>44 (12)</w:t>
+            </w:r>
+          </w:p>
+        </w:tc>
+        <w:tc>
+          <w:tcPr>
+            <w:tcW w:type="dxa" w:w="1308"/>
+          </w:tcPr>
+          <w:p>
+            <w:r>
+              <w:rPr>
+                <w:sz w:val="16"/>
+                <w:highlight w:val="green"/>
+              </w:rPr>
+              <w:t>9</w:t>
+            </w:r>
+          </w:p>
+        </w:tc>
+        <w:tc>
+          <w:tcPr>
+            <w:tcW w:type="dxa" w:w="1308"/>
+          </w:tcPr>
+          <w:p>
+            <w:r>
+              <w:rPr>
+                <w:sz w:val="16"/>
+                <w:highlight w:val="green"/>
+              </w:rPr>
+              <w:t>123</w:t>
+            </w:r>
+          </w:p>
+        </w:tc>
+        <w:tc>
+          <w:tcPr>
+            <w:tcW w:type="dxa" w:w="1308"/>
+          </w:tcPr>
+          <w:p>
+            <w:r>
+              <w:rPr>
+                <w:sz w:val="16"/>
+                <w:highlight w:val="green"/>
+              </w:rPr>
+              <w:t>336</w:t>
+            </w:r>
+          </w:p>
+        </w:tc>
+        <w:tc>
+          <w:tcPr>
+            <w:tcW w:type="dxa" w:w="1308"/>
+          </w:tcPr>
+          <w:p>
+            <w:r>
+              <w:rPr>
+                <w:sz w:val="16"/>
+                <w:highlight w:val="green"/>
+              </w:rPr>
+              <w:t>indirect (canopy-N proxy)</w:t>
+            </w:r>
+          </w:p>
+        </w:tc>
+      </w:tr>
+      <w:tr>
+        <w:tc>
+          <w:tcPr>
+            <w:tcW w:type="dxa" w:w="1308"/>
+          </w:tcPr>
+          <w:p>
+            <w:r>
+              <w:rPr>
+                <w:sz w:val="16"/>
+                <w:highlight w:val="green"/>
+              </w:rPr>
+              <w:t>SOC</w:t>
+            </w:r>
+          </w:p>
+        </w:tc>
+        <w:tc>
+          <w:tcPr>
+            <w:tcW w:type="dxa" w:w="1308"/>
+          </w:tcPr>
+          <w:p>
+            <w:r>
+              <w:rPr>
+                <w:sz w:val="16"/>
+                <w:highlight w:val="green"/>
+              </w:rPr>
+              <w:t>0.368</w:t>
+            </w:r>
+          </w:p>
+        </w:tc>
+        <w:tc>
+          <w:tcPr>
+            <w:tcW w:type="dxa" w:w="1308"/>
+          </w:tcPr>
+          <w:p>
+            <w:r>
+              <w:rPr>
+                <w:sz w:val="16"/>
+                <w:highlight w:val="green"/>
+              </w:rPr>
+              <w:t>0.25</w:t>
+            </w:r>
+          </w:p>
+        </w:tc>
+        <w:tc>
+          <w:tcPr>
+            <w:tcW w:type="dxa" w:w="1308"/>
+          </w:tcPr>
+          <w:p>
+            <w:r>
+              <w:rPr>
+                <w:sz w:val="16"/>
+                <w:highlight w:val="green"/>
+              </w:rPr>
+              <w:t>4 (0)</w:t>
+            </w:r>
+          </w:p>
+        </w:tc>
+        <w:tc>
+          <w:tcPr>
+            <w:tcW w:type="dxa" w:w="1308"/>
+          </w:tcPr>
+          <w:p>
+            <w:r>
+              <w:rPr>
+                <w:sz w:val="16"/>
+                <w:highlight w:val="green"/>
+              </w:rPr>
+              <w:t>13</w:t>
+            </w:r>
+          </w:p>
+        </w:tc>
+        <w:tc>
+          <w:tcPr>
+            <w:tcW w:type="dxa" w:w="1308"/>
+          </w:tcPr>
+          <w:p>
+            <w:r>
+              <w:rPr>
+                <w:sz w:val="16"/>
+                <w:highlight w:val="green"/>
+              </w:rPr>
+              <w:t>15</w:t>
+            </w:r>
+          </w:p>
+        </w:tc>
+        <w:tc>
+          <w:tcPr>
+            <w:tcW w:type="dxa" w:w="1308"/>
+          </w:tcPr>
+          <w:p>
+            <w:r>
+              <w:rPr>
+                <w:sz w:val="16"/>
+                <w:highlight w:val="green"/>
+              </w:rPr>
+              <w:t>480</w:t>
+            </w:r>
+          </w:p>
+        </w:tc>
+        <w:tc>
+          <w:tcPr>
+            <w:tcW w:type="dxa" w:w="1308"/>
+          </w:tcPr>
+          <w:p>
+            <w:r>
+              <w:rPr>
+                <w:sz w:val="16"/>
+                <w:highlight w:val="green"/>
+              </w:rPr>
+              <w:t>regional gradient only</w:t>
+            </w:r>
+          </w:p>
+        </w:tc>
+      </w:tr>
+      <w:tr>
+        <w:tc>
+          <w:tcPr>
+            <w:tcW w:type="dxa" w:w="1308"/>
+          </w:tcPr>
+          <w:p>
+            <w:r>
+              <w:rPr>
+                <w:sz w:val="16"/>
+                <w:highlight w:val="green"/>
+              </w:rPr>
+              <w:t>S</w:t>
+            </w:r>
+          </w:p>
+        </w:tc>
+        <w:tc>
+          <w:tcPr>
+            <w:tcW w:type="dxa" w:w="1308"/>
+          </w:tcPr>
+          <w:p>
+            <w:r>
+              <w:rPr>
+                <w:sz w:val="16"/>
+                <w:highlight w:val="green"/>
+              </w:rPr>
+              <w:t>0.309</w:t>
+            </w:r>
+          </w:p>
+        </w:tc>
+        <w:tc>
+          <w:tcPr>
+            <w:tcW w:type="dxa" w:w="1308"/>
+          </w:tcPr>
+          <w:p>
+            <w:r>
+              <w:rPr>
+                <w:sz w:val="16"/>
+                <w:highlight w:val="green"/>
+              </w:rPr>
+              <w:t>0.04</w:t>
+            </w:r>
+          </w:p>
+        </w:tc>
+        <w:tc>
+          <w:tcPr>
+            <w:tcW w:type="dxa" w:w="1308"/>
+          </w:tcPr>
+          <w:p>
+            <w:r>
+              <w:rPr>
+                <w:sz w:val="16"/>
+                <w:highlight w:val="green"/>
+              </w:rPr>
+              <w:t>0 (0)</w:t>
+            </w:r>
+          </w:p>
+        </w:tc>
+        <w:tc>
+          <w:tcPr>
+            <w:tcW w:type="dxa" w:w="1308"/>
+          </w:tcPr>
+          <w:p>
+            <w:r>
+              <w:rPr>
+                <w:sz w:val="16"/>
+                <w:highlight w:val="green"/>
+              </w:rPr>
+              <w:t>37</w:t>
+            </w:r>
+          </w:p>
+        </w:tc>
+        <w:tc>
+          <w:tcPr>
+            <w:tcW w:type="dxa" w:w="1308"/>
+          </w:tcPr>
+          <w:p>
+            <w:r>
+              <w:rPr>
+                <w:sz w:val="16"/>
+                <w:highlight w:val="green"/>
+              </w:rPr>
+              <w:t>77</w:t>
+            </w:r>
+          </w:p>
+        </w:tc>
+        <w:tc>
+          <w:tcPr>
+            <w:tcW w:type="dxa" w:w="1308"/>
+          </w:tcPr>
+          <w:p>
+            <w:r>
+              <w:rPr>
+                <w:sz w:val="16"/>
+                <w:highlight w:val="green"/>
+              </w:rPr>
+              <w:t>398</w:t>
+            </w:r>
+          </w:p>
+        </w:tc>
+        <w:tc>
+          <w:tcPr>
+            <w:tcW w:type="dxa" w:w="1308"/>
+          </w:tcPr>
+          <w:p>
+            <w:r>
+              <w:rPr>
+                <w:sz w:val="16"/>
+                <w:highlight w:val="green"/>
+              </w:rPr>
+              <w:t>unpredictable</w:t>
+            </w:r>
+          </w:p>
+        </w:tc>
+      </w:tr>
+    </w:tbl>
+    <w:p/>
+    <w:p>
+      <w:r>
+        <w:rPr>
+          <w:i/>
+          <w:sz w:val="16"/>
+          <w:highlight w:val="green"/>
+        </w:rPr>
+        <w:t>|ρ|max (LC): leakage-controlled univariate maximum (temporally-aligned pool); Farm-LOFO ρ: out-of-farm Random-Forest validation; counts: number of the 512 features in each class; (robust): generalizable features additionally passing |ρ_full| ≥ 0.30 and within-sign = pooled-sign. Pool totals: weak 2327, unstable 404, zonal-only 245, generalizable 96 (31 robust). For NO3, SOC and S the present full-pool screen yields slightly higher |ρ| than the companion predictive study [18] (0.290 / 0.350 / 0.280), which additionally excludes canopy/management proxies for the labile nutrients under leakage-aware selection; the two studies agree for pH, K2O and P2O5 (0.670 / 0.478 / 0.476).</w:t>
+      </w:r>
+    </w:p>
+    <w:p>
+      <w:r>
+        <w:rPr>
+          <w:b/>
+          <w:highlight w:val="green"/>
+        </w:rPr>
+        <w:t>Table 7a. Definitions of the four empirical feature classes.</w:t>
+      </w:r>
+    </w:p>
+    <w:tbl>
+      <w:tblPr>
+        <w:tblStyle w:val="aff1"/>
+        <w:tblW w:type="auto" w:w="0"/>
+        <w:tblLook w:firstColumn="1" w:firstRow="1" w:lastColumn="0" w:lastRow="0" w:noHBand="0" w:noVBand="1" w:val="04A0"/>
+      </w:tblPr>
+      <w:tblGrid>
+        <w:gridCol w:w="3489"/>
+        <w:gridCol w:w="3489"/>
+        <w:gridCol w:w="3489"/>
+      </w:tblGrid>
+      <w:tr>
+        <w:tc>
+          <w:tcPr>
+            <w:tcW w:type="dxa" w:w="3489"/>
+          </w:tcPr>
+          <w:p>
+            <w:r>
+              <w:rPr>
+                <w:b/>
+                <w:sz w:val="16"/>
+                <w:highlight w:val="green"/>
+              </w:rPr>
+              <w:t>Class</w:t>
+            </w:r>
+          </w:p>
+        </w:tc>
+        <w:tc>
+          <w:tcPr>
+            <w:tcW w:type="dxa" w:w="3489"/>
+          </w:tcPr>
+          <w:p>
+            <w:r>
+              <w:rPr>
+                <w:b/>
+                <w:sz w:val="16"/>
+                <w:highlight w:val="green"/>
+              </w:rPr>
+              <w:t>Rule</w:t>
+            </w:r>
+          </w:p>
+        </w:tc>
+        <w:tc>
+          <w:tcPr>
+            <w:tcW w:type="dxa" w:w="3489"/>
+          </w:tcPr>
+          <w:p>
+            <w:r>
+              <w:rPr>
+                <w:b/>
+                <w:sz w:val="16"/>
+                <w:highlight w:val="green"/>
+              </w:rPr>
+              <w:t>Meaning</w:t>
+            </w:r>
+          </w:p>
+        </w:tc>
+      </w:tr>
+      <w:tr>
+        <w:tc>
+          <w:tcPr>
+            <w:tcW w:type="dxa" w:w="3489"/>
+          </w:tcPr>
+          <w:p>
+            <w:r>
+              <w:rPr>
+                <w:sz w:val="16"/>
+                <w:highlight w:val="green"/>
+              </w:rPr>
+              <w:t>generalizable</w:t>
+            </w:r>
+          </w:p>
+        </w:tc>
+        <w:tc>
+          <w:tcPr>
+            <w:tcW w:type="dxa" w:w="3489"/>
+          </w:tcPr>
+          <w:p>
+            <w:r>
+              <w:rPr>
+                <w:sz w:val="16"/>
+                <w:highlight w:val="green"/>
+              </w:rPr>
+              <w:t>|within| ≥ 0.15 AND year-consistent</w:t>
+            </w:r>
+          </w:p>
+        </w:tc>
+        <w:tc>
+          <w:tcPr>
+            <w:tcW w:type="dxa" w:w="3489"/>
+          </w:tcPr>
+          <w:p>
+            <w:r>
+              <w:rPr>
+                <w:sz w:val="16"/>
+                <w:highlight w:val="green"/>
+              </w:rPr>
+              <w:t>real local signal, stable across years</w:t>
+            </w:r>
+          </w:p>
+        </w:tc>
+      </w:tr>
+      <w:tr>
+        <w:tc>
+          <w:tcPr>
+            <w:tcW w:type="dxa" w:w="3489"/>
+          </w:tcPr>
+          <w:p>
+            <w:r>
+              <w:rPr>
+                <w:sz w:val="16"/>
+                <w:highlight w:val="green"/>
+              </w:rPr>
+              <w:t>zonal-only</w:t>
+            </w:r>
+          </w:p>
+        </w:tc>
+        <w:tc>
+          <w:tcPr>
+            <w:tcW w:type="dxa" w:w="3489"/>
+          </w:tcPr>
+          <w:p>
+            <w:r>
+              <w:rPr>
+                <w:sz w:val="16"/>
+                <w:highlight w:val="green"/>
+              </w:rPr>
+              <w:t>high |ρ_full| &amp; |between|, |within| &lt; 0.15</w:t>
+            </w:r>
+          </w:p>
+        </w:tc>
+        <w:tc>
+          <w:tcPr>
+            <w:tcW w:type="dxa" w:w="3489"/>
+          </w:tcPr>
+          <w:p>
+            <w:r>
+              <w:rPr>
+                <w:sz w:val="16"/>
+                <w:highlight w:val="green"/>
+              </w:rPr>
+              <w:t>regional gradient only (mapping yes, local no)</w:t>
+            </w:r>
+          </w:p>
+        </w:tc>
+      </w:tr>
+      <w:tr>
+        <w:tc>
+          <w:tcPr>
+            <w:tcW w:type="dxa" w:w="3489"/>
+          </w:tcPr>
+          <w:p>
+            <w:r>
+              <w:rPr>
+                <w:sz w:val="16"/>
+                <w:highlight w:val="green"/>
+              </w:rPr>
+              <w:t>unstable</w:t>
+            </w:r>
+          </w:p>
+        </w:tc>
+        <w:tc>
+          <w:tcPr>
+            <w:tcW w:type="dxa" w:w="3489"/>
+          </w:tcPr>
+          <w:p>
+            <w:r>
+              <w:rPr>
+                <w:sz w:val="16"/>
+                <w:highlight w:val="green"/>
+              </w:rPr>
+              <w:t>ρ sign flips between 2022 and 2023</w:t>
+            </w:r>
+          </w:p>
+        </w:tc>
+        <w:tc>
+          <w:tcPr>
+            <w:tcW w:type="dxa" w:w="3489"/>
+          </w:tcPr>
+          <w:p>
+            <w:r>
+              <w:rPr>
+                <w:sz w:val="16"/>
+                <w:highlight w:val="green"/>
+              </w:rPr>
+              <w:t>non-transferable (year × location confound)</w:t>
+            </w:r>
+          </w:p>
+        </w:tc>
+      </w:tr>
+      <w:tr>
+        <w:tc>
+          <w:tcPr>
+            <w:tcW w:type="dxa" w:w="3489"/>
+          </w:tcPr>
+          <w:p>
+            <w:r>
+              <w:rPr>
+                <w:sz w:val="16"/>
+                <w:highlight w:val="green"/>
+              </w:rPr>
+              <w:t>weak</w:t>
+            </w:r>
+          </w:p>
+        </w:tc>
+        <w:tc>
+          <w:tcPr>
+            <w:tcW w:type="dxa" w:w="3489"/>
+          </w:tcPr>
+          <w:p>
+            <w:r>
+              <w:rPr>
+                <w:sz w:val="16"/>
+                <w:highlight w:val="green"/>
+              </w:rPr>
+              <w:t>none of the above</w:t>
+            </w:r>
+          </w:p>
+        </w:tc>
+        <w:tc>
+          <w:tcPr>
+            <w:tcW w:type="dxa" w:w="3489"/>
+          </w:tcPr>
+          <w:p>
+            <w:r>
+              <w:rPr>
+                <w:sz w:val="16"/>
+                <w:highlight w:val="green"/>
+              </w:rPr>
+              <w:t>no exploitable association</w:t>
+            </w:r>
+          </w:p>
+        </w:tc>
+      </w:tr>
+    </w:tbl>
+    <w:p/>
+    <w:p>
+      <w:r>
+        <w:rPr>
+          <w:b/>
+          <w:highlight w:val="green"/>
+        </w:rPr>
+        <w:t>Table 7b. GENERALIZABLE — top features (by within-block signal) and mechanism.</w:t>
+      </w:r>
+    </w:p>
+    <w:tbl>
+      <w:tblPr>
+        <w:tblStyle w:val="aff1"/>
+        <w:tblW w:type="auto" w:w="0"/>
+        <w:tblLook w:firstColumn="1" w:firstRow="1" w:lastColumn="0" w:lastRow="0" w:noHBand="0" w:noVBand="1" w:val="04A0"/>
+      </w:tblPr>
+      <w:tblGrid>
+        <w:gridCol w:w="2616"/>
+        <w:gridCol w:w="2616"/>
+        <w:gridCol w:w="2616"/>
+        <w:gridCol w:w="2616"/>
+      </w:tblGrid>
+      <w:tr>
+        <w:tc>
+          <w:tcPr>
+            <w:tcW w:type="dxa" w:w="2616"/>
+          </w:tcPr>
+          <w:p>
+            <w:r>
+              <w:rPr>
+                <w:b/>
+                <w:sz w:val="16"/>
+                <w:highlight w:val="green"/>
+              </w:rPr>
+              <w:t>Feature</w:t>
+            </w:r>
+          </w:p>
+        </w:tc>
+        <w:tc>
+          <w:tcPr>
+            <w:tcW w:type="dxa" w:w="2616"/>
+          </w:tcPr>
+          <w:p>
+            <w:r>
+              <w:rPr>
+                <w:b/>
+                <w:sz w:val="16"/>
+                <w:highlight w:val="green"/>
+              </w:rPr>
+              <w:t>Prop.</w:t>
+            </w:r>
+          </w:p>
+        </w:tc>
+        <w:tc>
+          <w:tcPr>
+            <w:tcW w:type="dxa" w:w="2616"/>
+          </w:tcPr>
+          <w:p>
+            <w:r>
+              <w:rPr>
+                <w:b/>
+                <w:sz w:val="16"/>
+                <w:highlight w:val="green"/>
+              </w:rPr>
+              <w:t>within (both-yr ρ)</w:t>
+            </w:r>
+          </w:p>
+        </w:tc>
+        <w:tc>
+          <w:tcPr>
+            <w:tcW w:type="dxa" w:w="2616"/>
+          </w:tcPr>
+          <w:p>
+            <w:r>
+              <w:rPr>
+                <w:b/>
+                <w:sz w:val="16"/>
+                <w:highlight w:val="green"/>
+              </w:rPr>
+              <w:t>Why a genuine local predictor</w:t>
+            </w:r>
+          </w:p>
+        </w:tc>
+      </w:tr>
+      <w:tr>
+        <w:tc>
+          <w:tcPr>
+            <w:tcW w:type="dxa" w:w="2616"/>
+          </w:tcPr>
+          <w:p>
+            <w:r>
+              <w:rPr>
+                <w:sz w:val="16"/>
+                <w:highlight w:val="green"/>
+              </w:rPr>
+              <w:t>GNDVI_L8 spring</w:t>
+            </w:r>
+          </w:p>
+        </w:tc>
+        <w:tc>
+          <w:tcPr>
+            <w:tcW w:type="dxa" w:w="2616"/>
+          </w:tcPr>
+          <w:p>
+            <w:r>
+              <w:rPr>
+                <w:sz w:val="16"/>
+                <w:highlight w:val="green"/>
+              </w:rPr>
+              <w:t>pH</w:t>
+            </w:r>
+          </w:p>
+        </w:tc>
+        <w:tc>
+          <w:tcPr>
+            <w:tcW w:type="dxa" w:w="2616"/>
+          </w:tcPr>
+          <w:p>
+            <w:r>
+              <w:rPr>
+                <w:sz w:val="16"/>
+                <w:highlight w:val="green"/>
+              </w:rPr>
+              <w:t>−0.32 (−0.29/−0.62)</w:t>
+            </w:r>
+          </w:p>
+        </w:tc>
+        <w:tc>
+          <w:tcPr>
+            <w:tcW w:type="dxa" w:w="2616"/>
+          </w:tcPr>
+          <w:p>
+            <w:r>
+              <w:rPr>
+                <w:sz w:val="16"/>
+                <w:highlight w:val="green"/>
+              </w:rPr>
+              <w:t>On bare spring soil GNDVI inverts to soil brightness → carbonate content that co-sets pH; mineralogy year-stable.</w:t>
+            </w:r>
+          </w:p>
+        </w:tc>
+      </w:tr>
+      <w:tr>
+        <w:tc>
+          <w:tcPr>
+            <w:tcW w:type="dxa" w:w="2616"/>
+          </w:tcPr>
+          <w:p>
+            <w:r>
+              <w:rPr>
+                <w:sz w:val="16"/>
+                <w:highlight w:val="green"/>
+              </w:rPr>
+              <w:t>GLCM contrast summer</w:t>
+            </w:r>
+          </w:p>
+        </w:tc>
+        <w:tc>
+          <w:tcPr>
+            <w:tcW w:type="dxa" w:w="2616"/>
+          </w:tcPr>
+          <w:p>
+            <w:r>
+              <w:rPr>
+                <w:sz w:val="16"/>
+                <w:highlight w:val="green"/>
+              </w:rPr>
+              <w:t>NO3</w:t>
+            </w:r>
+          </w:p>
+        </w:tc>
+        <w:tc>
+          <w:tcPr>
+            <w:tcW w:type="dxa" w:w="2616"/>
+          </w:tcPr>
+          <w:p>
+            <w:r>
+              <w:rPr>
+                <w:sz w:val="16"/>
+                <w:highlight w:val="green"/>
+              </w:rPr>
+              <w:t>+0.32 (+0.47/+0.18)</w:t>
+            </w:r>
+          </w:p>
+        </w:tc>
+        <w:tc>
+          <w:tcPr>
+            <w:tcW w:type="dxa" w:w="2616"/>
+          </w:tcPr>
+          <w:p>
+            <w:r>
+              <w:rPr>
+                <w:sz w:val="16"/>
+                <w:highlight w:val="green"/>
+              </w:rPr>
+              <w:t>Within-field crop-vigour patchiness: greener/more-textured = better-fertilised = more residual N (local proxy).</w:t>
+            </w:r>
+          </w:p>
+        </w:tc>
+      </w:tr>
+      <w:tr>
+        <w:tc>
+          <w:tcPr>
+            <w:tcW w:type="dxa" w:w="2616"/>
+          </w:tcPr>
+          <w:p>
+            <w:r>
+              <w:rPr>
+                <w:sz w:val="16"/>
+                <w:highlight w:val="green"/>
+              </w:rPr>
+              <w:t>SAVI_L8 spring</w:t>
+            </w:r>
+          </w:p>
+        </w:tc>
+        <w:tc>
+          <w:tcPr>
+            <w:tcW w:type="dxa" w:w="2616"/>
+          </w:tcPr>
+          <w:p>
+            <w:r>
+              <w:rPr>
+                <w:sz w:val="16"/>
+                <w:highlight w:val="green"/>
+              </w:rPr>
+              <w:t>pH</w:t>
+            </w:r>
+          </w:p>
+        </w:tc>
+        <w:tc>
+          <w:tcPr>
+            <w:tcW w:type="dxa" w:w="2616"/>
+          </w:tcPr>
+          <w:p>
+            <w:r>
+              <w:rPr>
+                <w:sz w:val="16"/>
+                <w:highlight w:val="green"/>
+              </w:rPr>
+              <w:t>−0.30 (−0.39/−0.41)</w:t>
+            </w:r>
+          </w:p>
+        </w:tc>
+        <w:tc>
+          <w:tcPr>
+            <w:tcW w:type="dxa" w:w="2616"/>
+          </w:tcPr>
+          <w:p>
+            <w:r>
+              <w:rPr>
+                <w:sz w:val="16"/>
+                <w:highlight w:val="green"/>
+              </w:rPr>
+              <w:t>Soil-adjusted bare-soil index — same carbonate/brightness mechanism as GNDVI.</w:t>
+            </w:r>
+          </w:p>
+        </w:tc>
+      </w:tr>
+      <w:tr>
+        <w:tc>
+          <w:tcPr>
+            <w:tcW w:type="dxa" w:w="2616"/>
+          </w:tcPr>
+          <w:p>
+            <w:r>
+              <w:rPr>
+                <w:sz w:val="16"/>
+                <w:highlight w:val="green"/>
+              </w:rPr>
+              <w:t>NBR_S2 spring</w:t>
+            </w:r>
+          </w:p>
+        </w:tc>
+        <w:tc>
+          <w:tcPr>
+            <w:tcW w:type="dxa" w:w="2616"/>
+          </w:tcPr>
+          <w:p>
+            <w:r>
+              <w:rPr>
+                <w:sz w:val="16"/>
+                <w:highlight w:val="green"/>
+              </w:rPr>
+              <w:t>K2O</w:t>
+            </w:r>
+          </w:p>
+        </w:tc>
+        <w:tc>
+          <w:tcPr>
+            <w:tcW w:type="dxa" w:w="2616"/>
+          </w:tcPr>
+          <w:p>
+            <w:r>
+              <w:rPr>
+                <w:sz w:val="16"/>
+                <w:highlight w:val="green"/>
+              </w:rPr>
+              <w:t>+0.29 (+0.12/+0.34)</w:t>
+            </w:r>
+          </w:p>
+        </w:tc>
+        <w:tc>
+          <w:tcPr>
+            <w:tcW w:type="dxa" w:w="2616"/>
+          </w:tcPr>
+          <w:p>
+            <w:r>
+              <w:rPr>
+                <w:sz w:val="16"/>
+                <w:highlight w:val="green"/>
+              </w:rPr>
+              <w:t>NBR uses SWIR (B12, clay-OH overtones); exchangeable K sits in the illitic clay/CEC fraction.</w:t>
+            </w:r>
+          </w:p>
+        </w:tc>
+      </w:tr>
+      <w:tr>
+        <w:tc>
+          <w:tcPr>
+            <w:tcW w:type="dxa" w:w="2616"/>
+          </w:tcPr>
+          <w:p>
+            <w:r>
+              <w:rPr>
+                <w:sz w:val="16"/>
+                <w:highlight w:val="green"/>
+              </w:rPr>
+              <w:t>ts_GNDVI_L8 mean</w:t>
+            </w:r>
+          </w:p>
+        </w:tc>
+        <w:tc>
+          <w:tcPr>
+            <w:tcW w:type="dxa" w:w="2616"/>
+          </w:tcPr>
+          <w:p>
+            <w:r>
+              <w:rPr>
+                <w:sz w:val="16"/>
+                <w:highlight w:val="green"/>
+              </w:rPr>
+              <w:t>NO3</w:t>
+            </w:r>
+          </w:p>
+        </w:tc>
+        <w:tc>
+          <w:tcPr>
+            <w:tcW w:type="dxa" w:w="2616"/>
+          </w:tcPr>
+          <w:p>
+            <w:r>
+              <w:rPr>
+                <w:sz w:val="16"/>
+                <w:highlight w:val="green"/>
+              </w:rPr>
+              <w:t>+0.29 (−0.14/−0.11)</w:t>
+            </w:r>
+          </w:p>
+        </w:tc>
+        <w:tc>
+          <w:tcPr>
+            <w:tcW w:type="dxa" w:w="2616"/>
+          </w:tcPr>
+          <w:p>
+            <w:r>
+              <w:rPr>
+                <w:sz w:val="16"/>
+                <w:highlight w:val="green"/>
+              </w:rPr>
+              <w:t>Multi-season greenness as within-field N proxy (positive within, negative regional → Simpson split).</w:t>
+            </w:r>
+          </w:p>
+        </w:tc>
+      </w:tr>
+    </w:tbl>
+    <w:p/>
+    <w:p>
+      <w:r>
+        <w:rPr>
+          <w:b/>
+          <w:highlight w:val="green"/>
+        </w:rPr>
+        <w:t>Table 7c. ZONAL-ONLY — top features (by between-block signal) and why they carry no local skill.</w:t>
+      </w:r>
+    </w:p>
+    <w:tbl>
+      <w:tblPr>
+        <w:tblStyle w:val="aff1"/>
+        <w:tblW w:type="auto" w:w="0"/>
+        <w:tblLook w:firstColumn="1" w:firstRow="1" w:lastColumn="0" w:lastRow="0" w:noHBand="0" w:noVBand="1" w:val="04A0"/>
+      </w:tblPr>
+      <w:tblGrid>
+        <w:gridCol w:w="2616"/>
+        <w:gridCol w:w="2616"/>
+        <w:gridCol w:w="2616"/>
+        <w:gridCol w:w="2616"/>
+      </w:tblGrid>
+      <w:tr>
+        <w:tc>
+          <w:tcPr>
+            <w:tcW w:type="dxa" w:w="2616"/>
+          </w:tcPr>
+          <w:p>
+            <w:r>
+              <w:rPr>
+                <w:b/>
+                <w:sz w:val="16"/>
+                <w:highlight w:val="green"/>
+              </w:rPr>
+              <w:t>Feature</w:t>
+            </w:r>
+          </w:p>
+        </w:tc>
+        <w:tc>
+          <w:tcPr>
+            <w:tcW w:type="dxa" w:w="2616"/>
+          </w:tcPr>
+          <w:p>
+            <w:r>
+              <w:rPr>
+                <w:b/>
+                <w:sz w:val="16"/>
+                <w:highlight w:val="green"/>
+              </w:rPr>
+              <w:t>Prop.</w:t>
+            </w:r>
+          </w:p>
+        </w:tc>
+        <w:tc>
+          <w:tcPr>
+            <w:tcW w:type="dxa" w:w="2616"/>
+          </w:tcPr>
+          <w:p>
+            <w:r>
+              <w:rPr>
+                <w:b/>
+                <w:sz w:val="16"/>
+                <w:highlight w:val="green"/>
+              </w:rPr>
+              <w:t>between / within</w:t>
+            </w:r>
+          </w:p>
+        </w:tc>
+        <w:tc>
+          <w:tcPr>
+            <w:tcW w:type="dxa" w:w="2616"/>
+          </w:tcPr>
+          <w:p>
+            <w:r>
+              <w:rPr>
+                <w:b/>
+                <w:sz w:val="16"/>
+                <w:highlight w:val="green"/>
+              </w:rPr>
+              <w:t>Why regional-only</w:t>
+            </w:r>
+          </w:p>
+        </w:tc>
+      </w:tr>
+      <w:tr>
+        <w:tc>
+          <w:tcPr>
+            <w:tcW w:type="dxa" w:w="2616"/>
+          </w:tcPr>
+          <w:p>
+            <w:r>
+              <w:rPr>
+                <w:sz w:val="16"/>
+                <w:highlight w:val="green"/>
+              </w:rPr>
+              <w:t>S2REP spring</w:t>
+            </w:r>
+          </w:p>
+        </w:tc>
+        <w:tc>
+          <w:tcPr>
+            <w:tcW w:type="dxa" w:w="2616"/>
+          </w:tcPr>
+          <w:p>
+            <w:r>
+              <w:rPr>
+                <w:sz w:val="16"/>
+                <w:highlight w:val="green"/>
+              </w:rPr>
+              <w:t>pH</w:t>
+            </w:r>
+          </w:p>
+        </w:tc>
+        <w:tc>
+          <w:tcPr>
+            <w:tcW w:type="dxa" w:w="2616"/>
+          </w:tcPr>
+          <w:p>
+            <w:r>
+              <w:rPr>
+                <w:sz w:val="16"/>
+                <w:highlight w:val="green"/>
+              </w:rPr>
+              <w:t>−0.75 / +0.06</w:t>
+            </w:r>
+          </w:p>
+        </w:tc>
+        <w:tc>
+          <w:tcPr>
+            <w:tcW w:type="dxa" w:w="2616"/>
+          </w:tcPr>
+          <w:p>
+            <w:r>
+              <w:rPr>
+                <w:sz w:val="16"/>
+                <w:highlight w:val="green"/>
+              </w:rPr>
+              <w:t>Red-edge position senses canopy at the regional scale; tracks the chernozem→kastanozem gradient, not within-field soil.</w:t>
+            </w:r>
+          </w:p>
+        </w:tc>
+      </w:tr>
+      <w:tr>
+        <w:tc>
+          <w:tcPr>
+            <w:tcW w:type="dxa" w:w="2616"/>
+          </w:tcPr>
+          <w:p>
+            <w:r>
+              <w:rPr>
+                <w:sz w:val="16"/>
+                <w:highlight w:val="green"/>
+              </w:rPr>
+              <w:t>GNDVI_S2 spring</w:t>
+            </w:r>
+          </w:p>
+        </w:tc>
+        <w:tc>
+          <w:tcPr>
+            <w:tcW w:type="dxa" w:w="2616"/>
+          </w:tcPr>
+          <w:p>
+            <w:r>
+              <w:rPr>
+                <w:sz w:val="16"/>
+                <w:highlight w:val="green"/>
+              </w:rPr>
+              <w:t>K2O</w:t>
+            </w:r>
+          </w:p>
+        </w:tc>
+        <w:tc>
+          <w:tcPr>
+            <w:tcW w:type="dxa" w:w="2616"/>
+          </w:tcPr>
+          <w:p>
+            <w:r>
+              <w:rPr>
+                <w:sz w:val="16"/>
+                <w:highlight w:val="green"/>
+              </w:rPr>
+              <w:t>−0.74 / −0.01</w:t>
+            </w:r>
+          </w:p>
+        </w:tc>
+        <w:tc>
+          <w:tcPr>
+            <w:tcW w:type="dxa" w:w="2616"/>
+          </w:tcPr>
+          <w:p>
+            <w:r>
+              <w:rPr>
+                <w:sz w:val="16"/>
+                <w:highlight w:val="green"/>
+              </w:rPr>
+              <w:t>Regional greenness gradient aligned with the zonal clay/K gradient; no sub-field content.</w:t>
+            </w:r>
+          </w:p>
+        </w:tc>
+      </w:tr>
+      <w:tr>
+        <w:tc>
+          <w:tcPr>
+            <w:tcW w:type="dxa" w:w="2616"/>
+          </w:tcPr>
+          <w:p>
+            <w:r>
+              <w:rPr>
+                <w:sz w:val="16"/>
+                <w:highlight w:val="green"/>
+              </w:rPr>
+              <w:t>NDRE spring</w:t>
+            </w:r>
+          </w:p>
+        </w:tc>
+        <w:tc>
+          <w:tcPr>
+            <w:tcW w:type="dxa" w:w="2616"/>
+          </w:tcPr>
+          <w:p>
+            <w:r>
+              <w:rPr>
+                <w:sz w:val="16"/>
+                <w:highlight w:val="green"/>
+              </w:rPr>
+              <w:t>pH</w:t>
+            </w:r>
+          </w:p>
+        </w:tc>
+        <w:tc>
+          <w:tcPr>
+            <w:tcW w:type="dxa" w:w="2616"/>
+          </w:tcPr>
+          <w:p>
+            <w:r>
+              <w:rPr>
+                <w:sz w:val="16"/>
+                <w:highlight w:val="green"/>
+              </w:rPr>
+              <w:t>−0.71 / −0.03</w:t>
+            </w:r>
+          </w:p>
+        </w:tc>
+        <w:tc>
+          <w:tcPr>
+            <w:tcW w:type="dxa" w:w="2616"/>
+          </w:tcPr>
+          <w:p>
+            <w:r>
+              <w:rPr>
+                <w:sz w:val="16"/>
+                <w:highlight w:val="green"/>
+              </w:rPr>
+              <w:t>Red-edge chlorophyll index = macro-climatic vegetation gradient parallel to carbonate leaching.</w:t>
+            </w:r>
+          </w:p>
+        </w:tc>
+      </w:tr>
+      <w:tr>
+        <w:tc>
+          <w:tcPr>
+            <w:tcW w:type="dxa" w:w="2616"/>
+          </w:tcPr>
+          <w:p>
+            <w:r>
+              <w:rPr>
+                <w:sz w:val="16"/>
+                <w:highlight w:val="green"/>
+              </w:rPr>
+              <w:t>NDWI_S2 spring</w:t>
+            </w:r>
+          </w:p>
+        </w:tc>
+        <w:tc>
+          <w:tcPr>
+            <w:tcW w:type="dxa" w:w="2616"/>
+          </w:tcPr>
+          <w:p>
+            <w:r>
+              <w:rPr>
+                <w:sz w:val="16"/>
+                <w:highlight w:val="green"/>
+              </w:rPr>
+              <w:t>K2O</w:t>
+            </w:r>
+          </w:p>
+        </w:tc>
+        <w:tc>
+          <w:tcPr>
+            <w:tcW w:type="dxa" w:w="2616"/>
+          </w:tcPr>
+          <w:p>
+            <w:r>
+              <w:rPr>
+                <w:sz w:val="16"/>
+                <w:highlight w:val="green"/>
+              </w:rPr>
+              <w:t>+0.69 / −0.06</w:t>
+            </w:r>
+          </w:p>
+        </w:tc>
+        <w:tc>
+          <w:tcPr>
+            <w:tcW w:type="dxa" w:w="2616"/>
+          </w:tcPr>
+          <w:p>
+            <w:r>
+              <w:rPr>
+                <w:sz w:val="16"/>
+                <w:highlight w:val="green"/>
+              </w:rPr>
+              <w:t>Canopy/soil-moisture index reflecting the regional rainfall gradient driving K zonation.</w:t>
+            </w:r>
+          </w:p>
+        </w:tc>
+      </w:tr>
+    </w:tbl>
+    <w:p/>
+    <w:p>
+      <w:r>
+        <w:rPr>
+          <w:b/>
+          <w:highlight w:val="green"/>
+        </w:rPr>
+        <w:t>Table 7d. UNSTABLE — top features (by cross-year sign-flip): all are time-invariant covariates, exposing the year × location confound.</w:t>
+      </w:r>
+    </w:p>
+    <w:tbl>
+      <w:tblPr>
+        <w:tblStyle w:val="aff1"/>
+        <w:tblW w:type="auto" w:w="0"/>
+        <w:tblLook w:firstColumn="1" w:firstRow="1" w:lastColumn="0" w:lastRow="0" w:noHBand="0" w:noVBand="1" w:val="04A0"/>
+      </w:tblPr>
+      <w:tblGrid>
+        <w:gridCol w:w="2616"/>
+        <w:gridCol w:w="2616"/>
+        <w:gridCol w:w="2616"/>
+        <w:gridCol w:w="2616"/>
+      </w:tblGrid>
+      <w:tr>
+        <w:tc>
+          <w:tcPr>
+            <w:tcW w:type="dxa" w:w="2616"/>
+          </w:tcPr>
+          <w:p>
+            <w:r>
+              <w:rPr>
+                <w:b/>
+                <w:sz w:val="16"/>
+                <w:highlight w:val="green"/>
+              </w:rPr>
+              <w:t>Feature</w:t>
+            </w:r>
+          </w:p>
+        </w:tc>
+        <w:tc>
+          <w:tcPr>
+            <w:tcW w:type="dxa" w:w="2616"/>
+          </w:tcPr>
+          <w:p>
+            <w:r>
+              <w:rPr>
+                <w:b/>
+                <w:sz w:val="16"/>
+                <w:highlight w:val="green"/>
+              </w:rPr>
+              <w:t>Prop.</w:t>
+            </w:r>
+          </w:p>
+        </w:tc>
+        <w:tc>
+          <w:tcPr>
+            <w:tcW w:type="dxa" w:w="2616"/>
+          </w:tcPr>
+          <w:p>
+            <w:r>
+              <w:rPr>
+                <w:b/>
+                <w:sz w:val="16"/>
+                <w:highlight w:val="green"/>
+              </w:rPr>
+              <w:t>ρ 2022 → 2023</w:t>
+            </w:r>
+          </w:p>
+        </w:tc>
+        <w:tc>
+          <w:tcPr>
+            <w:tcW w:type="dxa" w:w="2616"/>
+          </w:tcPr>
+          <w:p>
+            <w:r>
+              <w:rPr>
+                <w:b/>
+                <w:sz w:val="16"/>
+                <w:highlight w:val="green"/>
+              </w:rPr>
+              <w:t>Why it flips (artefact, not change)</w:t>
+            </w:r>
+          </w:p>
+        </w:tc>
+      </w:tr>
+      <w:tr>
+        <w:tc>
+          <w:tcPr>
+            <w:tcW w:type="dxa" w:w="2616"/>
+          </w:tcPr>
+          <w:p>
+            <w:r>
+              <w:rPr>
+                <w:sz w:val="16"/>
+                <w:highlight w:val="green"/>
+              </w:rPr>
+              <w:t>Aspect (sin)</w:t>
+            </w:r>
+          </w:p>
+        </w:tc>
+        <w:tc>
+          <w:tcPr>
+            <w:tcW w:type="dxa" w:w="2616"/>
+          </w:tcPr>
+          <w:p>
+            <w:r>
+              <w:rPr>
+                <w:sz w:val="16"/>
+                <w:highlight w:val="green"/>
+              </w:rPr>
+              <w:t>pH</w:t>
+            </w:r>
+          </w:p>
+        </w:tc>
+        <w:tc>
+          <w:tcPr>
+            <w:tcW w:type="dxa" w:w="2616"/>
+          </w:tcPr>
+          <w:p>
+            <w:r>
+              <w:rPr>
+                <w:sz w:val="16"/>
+                <w:highlight w:val="green"/>
+              </w:rPr>
+              <w:t>+0.83 → −0.51</w:t>
+            </w:r>
+          </w:p>
+        </w:tc>
+        <w:tc>
+          <w:tcPr>
+            <w:tcW w:type="dxa" w:w="2616"/>
+          </w:tcPr>
+          <w:p>
+            <w:r>
+              <w:rPr>
+                <w:sz w:val="16"/>
+                <w:highlight w:val="green"/>
+              </w:rPr>
+              <w:t>Aspect is time-invariant; a sign reversal is physically impossible temporally → year × location Simpson's paradox.</w:t>
+            </w:r>
+          </w:p>
+        </w:tc>
+      </w:tr>
+      <w:tr>
+        <w:tc>
+          <w:tcPr>
+            <w:tcW w:type="dxa" w:w="2616"/>
+          </w:tcPr>
+          <w:p>
+            <w:r>
+              <w:rPr>
+                <w:sz w:val="16"/>
+                <w:highlight w:val="green"/>
+              </w:rPr>
+              <w:t>Aspect (cos)</w:t>
+            </w:r>
+          </w:p>
+        </w:tc>
+        <w:tc>
+          <w:tcPr>
+            <w:tcW w:type="dxa" w:w="2616"/>
+          </w:tcPr>
+          <w:p>
+            <w:r>
+              <w:rPr>
+                <w:sz w:val="16"/>
+                <w:highlight w:val="green"/>
+              </w:rPr>
+              <w:t>SOC</w:t>
+            </w:r>
+          </w:p>
+        </w:tc>
+        <w:tc>
+          <w:tcPr>
+            <w:tcW w:type="dxa" w:w="2616"/>
+          </w:tcPr>
+          <w:p>
+            <w:r>
+              <w:rPr>
+                <w:sz w:val="16"/>
+                <w:highlight w:val="green"/>
+              </w:rPr>
+              <w:t>−0.64 → +0.62</w:t>
+            </w:r>
+          </w:p>
+        </w:tc>
+        <w:tc>
+          <w:tcPr>
+            <w:tcW w:type="dxa" w:w="2616"/>
+          </w:tcPr>
+          <w:p>
+            <w:r>
+              <w:rPr>
+                <w:sz w:val="16"/>
+                <w:highlight w:val="green"/>
+              </w:rPr>
+              <w:t>Static topography cannot reverse in one year; the flip is the disjoint-region confound.</w:t>
+            </w:r>
+          </w:p>
+        </w:tc>
+      </w:tr>
+      <w:tr>
+        <w:tc>
+          <w:tcPr>
+            <w:tcW w:type="dxa" w:w="2616"/>
+          </w:tcPr>
+          <w:p>
+            <w:r>
+              <w:rPr>
+                <w:sz w:val="16"/>
+                <w:highlight w:val="green"/>
+              </w:rPr>
+              <w:t>Slope</w:t>
+            </w:r>
+          </w:p>
+        </w:tc>
+        <w:tc>
+          <w:tcPr>
+            <w:tcW w:type="dxa" w:w="2616"/>
+          </w:tcPr>
+          <w:p>
+            <w:r>
+              <w:rPr>
+                <w:sz w:val="16"/>
+                <w:highlight w:val="green"/>
+              </w:rPr>
+              <w:t>SOC</w:t>
+            </w:r>
+          </w:p>
+        </w:tc>
+        <w:tc>
+          <w:tcPr>
+            <w:tcW w:type="dxa" w:w="2616"/>
+          </w:tcPr>
+          <w:p>
+            <w:r>
+              <w:rPr>
+                <w:sz w:val="16"/>
+                <w:highlight w:val="green"/>
+              </w:rPr>
+              <w:t>+0.66 → −0.48</w:t>
+            </w:r>
+          </w:p>
+        </w:tc>
+        <w:tc>
+          <w:tcPr>
+            <w:tcW w:type="dxa" w:w="2616"/>
+          </w:tcPr>
+          <w:p>
+            <w:r>
+              <w:rPr>
+                <w:sz w:val="16"/>
+                <w:highlight w:val="green"/>
+              </w:rPr>
+              <w:t>Slope is fixed and decadal SOC ~constant; reversal comes from the two years sampling different terrain.</w:t>
+            </w:r>
+          </w:p>
+        </w:tc>
+      </w:tr>
+      <w:tr>
+        <w:tc>
+          <w:tcPr>
+            <w:tcW w:type="dxa" w:w="2616"/>
+          </w:tcPr>
+          <w:p>
+            <w:r>
+              <w:rPr>
+                <w:sz w:val="16"/>
+                <w:highlight w:val="green"/>
+              </w:rPr>
+              <w:t>MAP</w:t>
+            </w:r>
+          </w:p>
+        </w:tc>
+        <w:tc>
+          <w:tcPr>
+            <w:tcW w:type="dxa" w:w="2616"/>
+          </w:tcPr>
+          <w:p>
+            <w:r>
+              <w:rPr>
+                <w:sz w:val="16"/>
+                <w:highlight w:val="green"/>
+              </w:rPr>
+              <w:t>SOC</w:t>
+            </w:r>
+          </w:p>
+        </w:tc>
+        <w:tc>
+          <w:tcPr>
+            <w:tcW w:type="dxa" w:w="2616"/>
+          </w:tcPr>
+          <w:p>
+            <w:r>
+              <w:rPr>
+                <w:sz w:val="16"/>
+                <w:highlight w:val="green"/>
+              </w:rPr>
+              <w:t>+0.73 → −0.34</w:t>
+            </w:r>
+          </w:p>
+        </w:tc>
+        <w:tc>
+          <w:tcPr>
+            <w:tcW w:type="dxa" w:w="2616"/>
+          </w:tcPr>
+          <w:p>
+            <w:r>
+              <w:rPr>
+                <w:sz w:val="16"/>
+                <w:highlight w:val="green"/>
+              </w:rPr>
+              <w:t>A ~9 km climate covariate; the 2022 and 2023 farm sets occupy opposite arms of the MAP–SOC gradient.</w:t>
+            </w:r>
+          </w:p>
+        </w:tc>
+      </w:tr>
+    </w:tbl>
+    <w:p/>
+    <w:p>
+      <w:r>
+        <w:rPr>
+          <w:b/>
+          <w:highlight w:val="green"/>
+        </w:rPr>
+        <w:t>Table 7e. Recommendations for predictive modelling, derived from the feature classification.</w:t>
+      </w:r>
+    </w:p>
+    <w:tbl>
+      <w:tblPr>
+        <w:tblStyle w:val="aff1"/>
+        <w:tblW w:type="auto" w:w="0"/>
+        <w:tblLook w:firstColumn="1" w:firstRow="1" w:lastColumn="0" w:lastRow="0" w:noHBand="0" w:noVBand="1" w:val="04A0"/>
+      </w:tblPr>
+      <w:tblGrid>
+        <w:gridCol w:w="3489"/>
+        <w:gridCol w:w="3489"/>
+        <w:gridCol w:w="3489"/>
+      </w:tblGrid>
+      <w:tr>
+        <w:tc>
+          <w:tcPr>
+            <w:tcW w:type="dxa" w:w="3489"/>
+          </w:tcPr>
+          <w:p>
+            <w:r>
+              <w:rPr>
+                <w:b/>
+                <w:sz w:val="16"/>
+                <w:highlight w:val="green"/>
+              </w:rPr>
+              <w:t>Recommendation</w:t>
+            </w:r>
+          </w:p>
+        </w:tc>
+        <w:tc>
+          <w:tcPr>
+            <w:tcW w:type="dxa" w:w="3489"/>
+          </w:tcPr>
+          <w:p>
+            <w:r>
+              <w:rPr>
+                <w:b/>
+                <w:sz w:val="16"/>
+                <w:highlight w:val="green"/>
+              </w:rPr>
+              <w:t>Pairs</w:t>
+            </w:r>
+          </w:p>
+        </w:tc>
+        <w:tc>
+          <w:tcPr>
+            <w:tcW w:type="dxa" w:w="3489"/>
+          </w:tcPr>
+          <w:p>
+            <w:r>
+              <w:rPr>
+                <w:b/>
+                <w:sz w:val="16"/>
+                <w:highlight w:val="green"/>
+              </w:rPr>
+              <w:t>Action for predictive modelling</w:t>
+            </w:r>
+          </w:p>
+        </w:tc>
+      </w:tr>
+      <w:tr>
+        <w:tc>
+          <w:tcPr>
+            <w:tcW w:type="dxa" w:w="3489"/>
+          </w:tcPr>
+          <w:p>
+            <w:r>
+              <w:rPr>
+                <w:sz w:val="16"/>
+                <w:highlight w:val="green"/>
+              </w:rPr>
+              <w:t>USE-PREDICTOR</w:t>
+            </w:r>
+          </w:p>
+        </w:tc>
+        <w:tc>
+          <w:tcPr>
+            <w:tcW w:type="dxa" w:w="3489"/>
+          </w:tcPr>
+          <w:p>
+            <w:r>
+              <w:rPr>
+                <w:sz w:val="16"/>
+                <w:highlight w:val="green"/>
+              </w:rPr>
+              <w:t>31</w:t>
+            </w:r>
+          </w:p>
+        </w:tc>
+        <w:tc>
+          <w:tcPr>
+            <w:tcW w:type="dxa" w:w="3489"/>
+          </w:tcPr>
+          <w:p>
+            <w:r>
+              <w:rPr>
+                <w:sz w:val="16"/>
+                <w:highlight w:val="green"/>
+              </w:rPr>
+              <w:t>Robust local signal → use as model input (spring bare-soil spectra for pH/K2O/P2O5).</w:t>
+            </w:r>
+          </w:p>
+        </w:tc>
+      </w:tr>
+      <w:tr>
+        <w:tc>
+          <w:tcPr>
+            <w:tcW w:type="dxa" w:w="3489"/>
+          </w:tcPr>
+          <w:p>
+            <w:r>
+              <w:rPr>
+                <w:sz w:val="16"/>
+                <w:highlight w:val="green"/>
+              </w:rPr>
+              <w:t>USE-WITH-CAUTION</w:t>
+            </w:r>
+          </w:p>
+        </w:tc>
+        <w:tc>
+          <w:tcPr>
+            <w:tcW w:type="dxa" w:w="3489"/>
+          </w:tcPr>
+          <w:p>
+            <w:r>
+              <w:rPr>
+                <w:sz w:val="16"/>
+                <w:highlight w:val="green"/>
+              </w:rPr>
+              <w:t>47</w:t>
+            </w:r>
+          </w:p>
+        </w:tc>
+        <w:tc>
+          <w:tcPr>
+            <w:tcW w:type="dxa" w:w="3489"/>
+          </w:tcPr>
+          <w:p>
+            <w:r>
+              <w:rPr>
+                <w:sz w:val="16"/>
+                <w:highlight w:val="green"/>
+              </w:rPr>
+              <w:t>Local but weak / proxy (esp. NO3 canopy-N); interpret, do not over-trust.</w:t>
+            </w:r>
+          </w:p>
+        </w:tc>
+      </w:tr>
+      <w:tr>
+        <w:tc>
+          <w:tcPr>
+            <w:tcW w:type="dxa" w:w="3489"/>
+          </w:tcPr>
+          <w:p>
+            <w:r>
+              <w:rPr>
+                <w:sz w:val="16"/>
+                <w:highlight w:val="green"/>
+              </w:rPr>
+              <w:t>CONTROL-COVARIATE</w:t>
+            </w:r>
+          </w:p>
+        </w:tc>
+        <w:tc>
+          <w:tcPr>
+            <w:tcW w:type="dxa" w:w="3489"/>
+          </w:tcPr>
+          <w:p>
+            <w:r>
+              <w:rPr>
+                <w:sz w:val="16"/>
+                <w:highlight w:val="green"/>
+              </w:rPr>
+              <w:t>221</w:t>
+            </w:r>
+          </w:p>
+        </w:tc>
+        <w:tc>
+          <w:tcPr>
+            <w:tcW w:type="dxa" w:w="3489"/>
+          </w:tcPr>
+          <w:p>
+            <w:r>
+              <w:rPr>
+                <w:sz w:val="16"/>
+                <w:highlight w:val="green"/>
+              </w:rPr>
+              <w:t>Zonal/regional features (climate, coarse covariates): include ONLY under farm-blocked CV or as a stratifier to partial out — never as a stand-alone local predictor.</w:t>
+            </w:r>
+          </w:p>
+        </w:tc>
+      </w:tr>
+      <w:tr>
+        <w:tc>
+          <w:tcPr>
+            <w:tcW w:type="dxa" w:w="3489"/>
+          </w:tcPr>
+          <w:p>
+            <w:r>
+              <w:rPr>
+                <w:sz w:val="16"/>
+                <w:highlight w:val="green"/>
+              </w:rPr>
+              <w:t>EXCLUDE-UNSTABLE</w:t>
+            </w:r>
+          </w:p>
+        </w:tc>
+        <w:tc>
+          <w:tcPr>
+            <w:tcW w:type="dxa" w:w="3489"/>
+          </w:tcPr>
+          <w:p>
+            <w:r>
+              <w:rPr>
+                <w:sz w:val="16"/>
+                <w:highlight w:val="green"/>
+              </w:rPr>
+              <w:t>404</w:t>
+            </w:r>
+          </w:p>
+        </w:tc>
+        <w:tc>
+          <w:tcPr>
+            <w:tcW w:type="dxa" w:w="3489"/>
+          </w:tcPr>
+          <w:p>
+            <w:r>
+              <w:rPr>
+                <w:sz w:val="16"/>
+                <w:highlight w:val="green"/>
+              </w:rPr>
+              <w:t>Year × location-confounded (sign flips, incl. raw topo/climate) → exclude.</w:t>
+            </w:r>
+          </w:p>
+        </w:tc>
+      </w:tr>
+      <w:tr>
+        <w:tc>
+          <w:tcPr>
+            <w:tcW w:type="dxa" w:w="3489"/>
+          </w:tcPr>
+          <w:p>
+            <w:r>
+              <w:rPr>
+                <w:sz w:val="16"/>
+                <w:highlight w:val="green"/>
+              </w:rPr>
+              <w:t>EXCLUDE-TEMPORAL</w:t>
+            </w:r>
+          </w:p>
+        </w:tc>
+        <w:tc>
+          <w:tcPr>
+            <w:tcW w:type="dxa" w:w="3489"/>
+          </w:tcPr>
+          <w:p>
+            <w:r>
+              <w:rPr>
+                <w:sz w:val="16"/>
+                <w:highlight w:val="green"/>
+              </w:rPr>
+              <w:t>42</w:t>
+            </w:r>
+          </w:p>
+        </w:tc>
+        <w:tc>
+          <w:tcPr>
+            <w:tcW w:type="dxa" w:w="3489"/>
+          </w:tcPr>
+          <w:p>
+            <w:r>
+              <w:rPr>
+                <w:sz w:val="16"/>
+                <w:highlight w:val="green"/>
+              </w:rPr>
+              <w:t>Cross-season features for labile NO3/S → temporal-mismatch leakage.</w:t>
+            </w:r>
+          </w:p>
+        </w:tc>
+      </w:tr>
+      <w:tr>
+        <w:tc>
+          <w:tcPr>
+            <w:tcW w:type="dxa" w:w="3489"/>
+          </w:tcPr>
+          <w:p>
+            <w:r>
+              <w:rPr>
+                <w:sz w:val="16"/>
+                <w:highlight w:val="green"/>
+              </w:rPr>
+              <w:t>DROP-WEAK</w:t>
+            </w:r>
+          </w:p>
+        </w:tc>
+        <w:tc>
+          <w:tcPr>
+            <w:tcW w:type="dxa" w:w="3489"/>
+          </w:tcPr>
+          <w:p>
+            <w:r>
+              <w:rPr>
+                <w:sz w:val="16"/>
+                <w:highlight w:val="green"/>
+              </w:rPr>
+              <w:t>2327</w:t>
+            </w:r>
+          </w:p>
+        </w:tc>
+        <w:tc>
+          <w:tcPr>
+            <w:tcW w:type="dxa" w:w="3489"/>
+          </w:tcPr>
+          <w:p>
+            <w:r>
+              <w:rPr>
+                <w:sz w:val="16"/>
+                <w:highlight w:val="green"/>
+              </w:rPr>
+              <w:t>No exploitable association.</w:t>
+            </w:r>
+          </w:p>
+        </w:tc>
+      </w:tr>
+    </w:tbl>
+    <w:p/>
+    <w:p>
+      <w:pPr>
         <w:pStyle w:val="MDPI22heading2"/>
         <w:spacing w:before="240" w:after="60"/>
         <w:rPr/>
@@ -42802,6 +45228,50 @@
     <w:p>
       <w:pPr>
         <w:pStyle w:val="MDPI22heading2"/>
+      </w:pPr>
+      <w:r>
+        <w:rPr>
+          <w:highlight w:val="green"/>
+        </w:rPr>
+        <w:t>4.5. Genuine versus artefactual signal: a leakage-aware synthesis</w:t>
+      </w:r>
+    </w:p>
+    <w:p>
+      <w:pPr>
+        <w:pStyle w:val="MDPI31text"/>
+      </w:pPr>
+      <w:r>
+        <w:rPr>
+          <w:highlight w:val="green"/>
+        </w:rPr>
+        <w:t>The four-class decomposition (Tables 7, 7a) reframes the screening: of 512 features only 31 (the robust generalizable tail) carry transferable local skill, and they are almost entirely spring bare-soil chromophores for the mineralogically anchored properties (pH, K2O, P2O5; Table 7b). NO3’s apparent skill is a Simpson-reversed canopy-nitrogen proxy (within-field +0.28 vs regional −0.45), S has no usable feature (sulfate lacks diagnostic 400–2500 nm absorption), and SOC — classically the most RS-mapped property — fails here through sign cancellation (93% within/between sign discordance), consistent with the narrow, uniformly dark chernozem organic-matter range.</w:t>
+      </w:r>
+    </w:p>
+    <w:p>
+      <w:pPr>
+        <w:pStyle w:val="MDPI31text"/>
+      </w:pPr>
+      <w:r>
+        <w:rPr>
+          <w:highlight w:val="green"/>
+        </w:rPr>
+        <w:t>The remaining classes show how a pooled correlation misleads. The zonal-only class (245 features; mean |between| 0.49 vs |within| 0.06) is regional pseudoreplication — geography sensed as if it were soil — exactly the inflation that block- and farm-level cross-validation expose (Roberts et al. 2017; Meyer et al. 2019; Ploton et al. 2020) and that random or field-level CV silently rewards. The unstable class (404) is a year×location Simpson’s paradox: physically time-invariant covariates (slope, aspect, MAP) reverse sign between the spatially disjoint 2022 and 2023 campaigns, so these correlations cannot be temporal and must not be used as predictors (cf. target-oriented validation, Meyer et al. 2018).</w:t>
+      </w:r>
+    </w:p>
+    <w:p>
+      <w:pPr>
+        <w:pStyle w:val="MDPI31text"/>
+      </w:pPr>
+      <w:r>
+        <w:rPr>
+          <w:highlight w:val="green"/>
+        </w:rPr>
+        <w:t>These results set the empirical limits of optical RS for the region and yield concrete modelling guidance (Table 7e): use season-matched bare-soil spectra as predictors; treat regional climate/topographic covariates only as controlled context under farm-blocked CV, never as stand-alone local predictors; exclude cross-season features for the labile nutrients; and report screening correlations with their between/within decomposition and an out-of-farm check rather than a pooled |ρ| alone. The companion predictive study [18] operationalises these limits; the present classification explains why each property sits where it does. We note the spatial-CV debate: Wadoux et al. (2021) caution that design-based sampling, not spatial CV, is appropriate for map-accuracy estimation — a distinction between assessing a model and assessing a map.</w:t>
+      </w:r>
+    </w:p>
+    <w:p>
+      <w:pPr>
+        <w:pStyle w:val="MDPI22heading2"/>
         <w:spacing w:before="240" w:after="60"/>
         <w:rPr>
           <w:i w:val="false"/>
@@ -42810,11 +45280,9 @@
       </w:pPr>
       <w:r>
         <w:rPr>
-          <w:i w:val="false"/>
-          <w:iCs w:val="false"/>
           <w:highlight w:val="green"/>
         </w:rPr>
-        <w:t>4.5. Limitations of the study</w:t>
+        <w:t>4.6. Limitations of the study</w:t>
       </w:r>
     </w:p>
     <w:p>
@@ -43110,6 +45578,12 @@
           <w:t>https://zenodo.org/records/19496443</w:t>
         </w:r>
       </w:hyperlink>
+      <w:r>
+        <w:rPr>
+          <w:highlight w:val="green"/>
+        </w:rPr>
+        <w:t>Code and reproducible outputs for this correlation-screening study are available at https://github.com/&lt;account&gt;/soil-rs-correlation-screening (released on acceptance), with an archived snapshot deposited on Zenodo (DOI assigned on release). This repository is independent of the companion predictive-modelling study [18].</w:t>
+      </w:r>
     </w:p>
     <w:p>
       <w:pPr>

</xml_diff>

<commit_message>
Make ICC-predictability the key figure: replace stale Figure 12 in manuscript
The manuscript already contained this plot as Figure 12, but the embedded image
was the pre-leakage-fix version (sulfur on top, spurious negative slope) and
contradicted the surrounding text. Replaced word/media/image12.png with the
corrected figure (ICC vs out-of-farm Farm-LOFO rho, +0.83; naive screening
overlaid; sulfur collapse). Caption + Sec 3.7 intro rewritten (green). CHANGELOG updated.

Co-Authored-By: Claude Opus 4.8 <noreply@anthropic.com>
</commit_message>
<xml_diff>
--- a/article/manuscript_edited.docx
+++ b/article/manuscript_edited.docx
@@ -41259,41 +41259,11 @@
         <w:rPr/>
       </w:pPr>
       <w:r>
-        <w:rPr/>
-        <w:t>The correlation of ICC with |</w:t>
-      </w:r>
-      <w:r>
-        <w:rPr>
-          <w:i/>
-          <w:iCs/>
-          <w:lang w:val="ru-RU"/>
-        </w:rPr>
-        <w:t>ρ</w:t>
-      </w:r>
-      <w:r>
-        <w:rPr/>
-        <w:t>|</w:t>
-      </w:r>
-      <w:r>
-        <w:rPr>
-          <w:vertAlign w:val="subscript"/>
-        </w:rPr>
-        <w:t>max</w:t>
-      </w:r>
-      <w:r>
-        <w:rPr/>
-        <w:t xml:space="preserve"> (Figure 12) illustrates the idea that the proportion of between-field variance limits the "ceiling" of predictability from RS data. At </w:t>
-      </w:r>
-      <w:r>
-        <w:rPr>
-          <w:i/>
-          <w:iCs/>
-        </w:rPr>
-        <w:t>n</w:t>
-      </w:r>
-      <w:r>
-        <w:rPr/>
-        <w:t xml:space="preserve"> = 6 (six properties), this relationship is descriptive in nature, with pH serving as a leverage point.</w:t>
+        <w:rPr>
+          <w:b w:val="0"/>
+          <w:highlight w:val="green"/>
+        </w:rPr>
+        <w:t>The relationship between ICC and predictability (Figure 12) makes the central message of this study explicit: the share of between-field variance sets the ceiling on how well a property can be recovered from remote sensing. Honest out-of-farm predictability (Farm-LOFO ρ) increases with ICC (Spearman ρ = +0.83, p = 0.04), whereas naïve in-sample screening |ρ| over all 512 features lies systematically above it, and the inflation is largest exactly where between-field structure is weakest. Sulfur is the limiting case — the lowest ICC (0.17) yet a high in-sample |ρ| ≈ 0.42 that collapses to ρ ≈ 0.04 out of farm — so its apparent correlation reflects leakage rather than signal. At n = 6 properties the relationship is descriptive (the naïve-screening counterpart is not significant, p = 0.27), with pH acting as a leverage point.</w:t>
       </w:r>
     </w:p>
     <w:p>
@@ -41460,7 +41430,7 @@
         <w:rPr/>
         <w:drawing>
           <wp:inline distT="0" distB="0" distL="0" distR="0">
-            <wp:extent cx="5644515" cy="4640580"/>
+            <wp:extent cx="5644515" cy="4171261"/>
             <wp:effectExtent l="0" t="0" r="0" b="0"/>
             <wp:docPr id="12" name="Рисунок 10"/>
             <wp:cNvGraphicFramePr>
@@ -41484,7 +41454,7 @@
                   <pic:spPr bwMode="auto">
                     <a:xfrm>
                       <a:off x="0" y="0"/>
-                      <a:ext cx="5644515" cy="4640580"/>
+                      <a:ext cx="5644515" cy="4171261"/>
                     </a:xfrm>
                     <a:prstGeom prst="rect">
                       <a:avLst/>
@@ -41508,72 +41478,16 @@
       <w:r>
         <w:rPr>
           <w:b/>
-          <w:sz w:val="18"/>
-          <w:szCs w:val="18"/>
+          <w:highlight w:val="green"/>
         </w:rPr>
         <w:t xml:space="preserve">Figure 12. </w:t>
       </w:r>
       <w:r>
         <w:rPr>
-          <w:bCs/>
-          <w:sz w:val="18"/>
-          <w:szCs w:val="18"/>
-        </w:rPr>
-        <w:t xml:space="preserve">Relationship between ICC (proportion of between-field variance) and maximum </w:t>
-      </w:r>
-      <w:r>
-        <w:rPr>
-          <w:bCs/>
-          <w:iCs/>
-          <w:sz w:val="18"/>
-          <w:szCs w:val="18"/>
-        </w:rPr>
-        <w:t>|</w:t>
-      </w:r>
-      <w:r>
-        <w:rPr>
-          <w:bCs/>
-          <w:i/>
-          <w:sz w:val="18"/>
-          <w:szCs w:val="18"/>
-          <w:lang w:val="ru-RU"/>
-        </w:rPr>
-        <w:t>ρ</w:t>
-      </w:r>
-      <w:r>
-        <w:rPr>
-          <w:bCs/>
-          <w:iCs/>
-          <w:sz w:val="18"/>
-          <w:szCs w:val="18"/>
-        </w:rPr>
-        <w:t xml:space="preserve">| </w:t>
-      </w:r>
-      <w:r>
-        <w:rPr>
-          <w:bCs/>
-          <w:sz w:val="18"/>
-          <w:szCs w:val="18"/>
-        </w:rPr>
-        <w:t xml:space="preserve"> with RS features. Each point represents one soil property (</w:t>
-      </w:r>
-      <w:r>
-        <w:rPr>
-          <w:bCs/>
-          <w:i/>
-          <w:iCs/>
-          <w:sz w:val="18"/>
-          <w:szCs w:val="18"/>
-        </w:rPr>
-        <w:t>n</w:t>
-      </w:r>
-      <w:r>
-        <w:rPr>
-          <w:bCs/>
-          <w:sz w:val="18"/>
-          <w:szCs w:val="18"/>
-        </w:rPr>
-        <w:t xml:space="preserve"> = 6). The relationship is illustrative rather than conclusive in nature.</w:t>
+          <w:b w:val="0"/>
+          <w:highlight w:val="green"/>
+        </w:rPr>
+        <w:t>Between-field structure (ICC) versus correlation with the best remote-sensing feature, per soil property (n = 6). Filled markers: honest out-of-farm Farm-LOFO ρ (coloured by generalisation verdict); open markers: naïve in-sample screening |ρ| over all 512 features; arrows show the in-sample → out-of-farm collapse. Out-of-farm predictability rises with ICC (Spearman ρ = +0.83, p = 0.04), whereas the naïve-screening relationship is not significant (p = 0.27). Sulfur (lowest ICC) drops from |ρ| ≈ 0.42 to ρ ≈ 0.04, marking its correlation as leakage rather than signal. The relationship is descriptive rather than conclusive.</w:t>
       </w:r>
     </w:p>
     <w:p>

</xml_diff>

<commit_message>
Wire in Zenodo DOI 10.5281/zenodo.20820838
- README: DOI + CC-BY-4.0 badges
- .zenodo.json: polished description
- manuscript Data Availability: real DOI, vel5id account, de-concatenated links (green)

Co-Authored-By: Claude Opus 4.8 <noreply@anthropic.com>
</commit_message>
<xml_diff>
--- a/article/manuscript_edited.docx
+++ b/article/manuscript_edited.docx
@@ -45464,39 +45464,19 @@
         <w:pStyle w:val="MDPI62backmatter"/>
         <w:rPr/>
       </w:pPr>
-      <w:hyperlink r:id="rId17">
-        <w:r>
-          <w:rPr>
-            <w:rStyle w:val="Hyperlink"/>
-            <w:color w:val="auto"/>
-            <w:u w:val="none"/>
-          </w:rPr>
-          <w:t>https://github.com/vel5id/science_SOC_predicting</w:t>
-        </w:r>
-      </w:hyperlink>
-      <w:hyperlink r:id="rId18">
-        <w:r>
-          <w:rPr>
-            <w:rStyle w:val="Hyperlink"/>
-            <w:color w:val="auto"/>
-            <w:u w:val="none"/>
-          </w:rPr>
-          <w:t>https://zenodo.org/records/19496423</w:t>
-        </w:r>
-      </w:hyperlink>
-      <w:hyperlink r:id="rId19">
-        <w:r>
-          <w:rPr>
-            <w:rStyle w:val="Hyperlink"/>
-          </w:rPr>
-          <w:t>https://zenodo.org/records/19496443</w:t>
-        </w:r>
-      </w:hyperlink>
-      <w:r>
-        <w:rPr>
+      <w:r>
+        <w:rPr>
+          <w:b/>
           <w:highlight w:val="green"/>
         </w:rPr>
-        <w:t>Code and reproducible outputs for this correlation-screening study are available at https://github.com/&lt;account&gt;/soil-rs-correlation-screening (released on acceptance), with an archived snapshot deposited on Zenodo (DOI assigned on release). This repository is independent of the companion predictive-modelling study [18].</w:t>
+        <w:t xml:space="preserve">Data Availability Statement: </w:t>
+      </w:r>
+      <w:r>
+        <w:rPr>
+          <w:b w:val="0"/>
+          <w:highlight w:val="green"/>
+        </w:rPr>
+        <w:t>The soil dataset underlying this study is shared with the companion predictive-modelling study [18], whose data and code are archived at https://github.com/vel5id/science_SOC_predicting (Zenodo: https://doi.org/10.5281/zenodo.19496423 and https://doi.org/10.5281/zenodo.19496443). The code and reproducible outputs for the present correlation-screening study are openly available at https://github.com/vel5id/soil-rs-correlation-screening, with an archived snapshot deposited on Zenodo (https://doi.org/10.5281/zenodo.20820838). This repository is independent of [18] and shares no results or manuscript text.</w:t>
       </w:r>
     </w:p>
     <w:p>

</xml_diff>